<commit_message>
publish final evidence-bound agency assessments
</commit_message>
<xml_diff>
--- a/reports/AEGENT-CertiK-Security-Assessment-2026-07-Executive-Summary.docx
+++ b/reports/AEGENT-CertiK-Security-Assessment-2026-07-Executive-Summary.docx
@@ -4,14 +4,13 @@
   <w:body>
     <w:p>
       <w:pPr>
-        <w:spacing w:before="0" w:after="0"/>
-        <w:jc w:val="center"/>
+        <w:spacing w:after="0"/>
       </w:pPr>
       <w:r>
         <w:drawing>
           <wp:inline xmlns:a="http://schemas.openxmlformats.org/drawingml/2006/main" xmlns:pic="http://schemas.openxmlformats.org/drawingml/2006/picture">
-            <wp:extent cx="7562088" cy="10689336"/>
-            <wp:docPr id="1" name="Picture 1" descr="AEGENT CertiK Security Assessment Executive Summary, page 1"/>
+            <wp:extent cx="7560000" cy="10688400"/>
+            <wp:docPr id="1" name="Picture 1"/>
             <wp:cNvGraphicFramePr>
               <a:graphicFrameLocks noChangeAspect="1"/>
             </wp:cNvGraphicFramePr>
@@ -19,7 +18,7 @@
               <a:graphicData uri="http://schemas.openxmlformats.org/drawingml/2006/picture">
                 <pic:pic>
                   <pic:nvPicPr>
-                    <pic:cNvPr id="0" name="page-01.png"/>
+                    <pic:cNvPr id="0" name="certik-aegent-cover-300dpi.png"/>
                     <pic:cNvPicPr/>
                   </pic:nvPicPr>
                   <pic:blipFill>
@@ -31,7 +30,7 @@
                   <pic:spPr>
                     <a:xfrm>
                       <a:off x="0" y="0"/>
-                      <a:ext cx="7562088" cy="10689336"/>
+                      <a:ext cx="7560000" cy="10688400"/>
                     </a:xfrm>
                     <a:prstGeom prst="rect"/>
                   </pic:spPr>
@@ -44,14 +43,781 @@
     </w:p>
     <w:p>
       <w:pPr>
-        <w:spacing w:before="0" w:after="0"/>
+        <w:sectPr>
+          <w:headerReference w:type="default" r:id="rId13"/>
+          <w:footerReference w:type="default" r:id="rId14"/>
+          <w:pgSz w:w="11906" w:h="16838"/>
+          <w:pgMar w:top="0" w:right="0" w:bottom="0" w:left="0" w:header="720" w:footer="720" w:gutter="0"/>
+          <w:cols w:space="720"/>
+          <w:docGrid w:linePitch="360"/>
+        </w:sectPr>
+      </w:pPr>
+    </w:p>
+    <w:p>
+      <w:pPr>
+        <w:pStyle w:val="Kicker"/>
+      </w:pPr>
+      <w:r>
+        <w:t>EXECUTIVE SUMMARY</w:t>
+      </w:r>
+    </w:p>
+    <w:p>
+      <w:pPr>
+        <w:pStyle w:val="Heading1"/>
+      </w:pPr>
+      <w:r>
+        <w:t>AEGENT Smart Contract Security Assessment</w:t>
+      </w:r>
+    </w:p>
+    <w:p>
+      <w:pPr>
+        <w:spacing w:after="200" w:line="96" w:lineRule="auto"/>
+      </w:pPr>
+      <w:r>
+        <w:rPr>
+          <w:rFonts w:ascii="Arial" w:hAnsi="Arial"/>
+          <w:color w:val="E03E5B"/>
+          <w:sz w:val="12"/>
+        </w:rPr>
+        <w:t>━━━━━━━━━━━━━━━━━━━━━━━━━━━━━━━━━━━━━━━━━━━━━━━━━━━━━━━━━━━━</w:t>
+      </w:r>
+    </w:p>
+    <w:tbl>
+      <w:tblPr>
+        <w:tblW w:type="auto" w:w="0"/>
+        <w:jc w:val="center"/>
+        <w:tblLayout w:type="fixed"/>
+        <w:tblLook w:firstColumn="1" w:firstRow="1" w:lastColumn="0" w:lastRow="0" w:noHBand="0" w:noVBand="1" w:val="04A0"/>
+      </w:tblPr>
+      <w:tblGrid>
+        <w:gridCol w:w="10148"/>
+      </w:tblGrid>
+      <w:tr>
+        <w:tc>
+          <w:tcPr>
+            <w:tcW w:type="dxa" w:w="9000"/>
+            <w:tcMar>
+              <w:top w:w="160" w:type="dxa"/>
+              <w:start w:w="180" w:type="dxa"/>
+              <w:bottom w:w="160" w:type="dxa"/>
+              <w:end w:w="180" w:type="dxa"/>
+            </w:tcMar>
+            <w:shd w:fill="EEF2F8"/>
+            <w:tcBorders>
+              <w:left w:val="single" w:sz="28" w:color="E33F5E"/>
+            </w:tcBorders>
+          </w:tcPr>
+          <w:p>
+            <w:pPr>
+              <w:spacing w:after="0"/>
+            </w:pPr>
+            <w:r>
+              <w:rPr>
+                <w:rFonts w:ascii="Arial" w:hAnsi="Arial"/>
+                <w:b/>
+                <w:color w:val="2A2D34"/>
+                <w:sz w:val="18"/>
+              </w:rPr>
+              <w:t>RELEASE POSTURE: NO OPEN FINDINGS IN CURRENT REGISTER · 0 OPEN BLOCKER(S).</w:t>
+            </w:r>
+          </w:p>
+        </w:tc>
+      </w:tr>
+    </w:tbl>
+    <w:p>
+      <w:pPr>
+        <w:keepLines/>
+        <w:widowControl/>
+      </w:pPr>
+      <w:r>
+        <w:t>CertiK assessed 11 production Solidity files for market state, purchase, reserve-backed redemption, proceeds custody and staking. All 9 tracked source-level findings are remediated and verified in the final frozen source. Production deployment, address/bytecode binding and continuing operations remain separate assurance gates. The assessment is bound to the evidence run, scope root and manifest printed below.</w:t>
+      </w:r>
+    </w:p>
+    <w:tbl>
+      <w:tblPr>
+        <w:tblW w:type="auto" w:w="0"/>
+        <w:jc w:val="center"/>
+        <w:tblLayout w:type="fixed"/>
+        <w:tblLook w:firstColumn="1" w:firstRow="1" w:lastColumn="0" w:lastRow="0" w:noHBand="0" w:noVBand="1" w:val="04A0"/>
+      </w:tblPr>
+      <w:tblGrid>
+        <w:gridCol w:w="5074"/>
+        <w:gridCol w:w="5074"/>
+      </w:tblGrid>
+      <w:tr>
+        <w:trPr>
+          <w:tblHeader w:val="true"/>
+        </w:trPr>
+        <w:tc>
+          <w:tcPr>
+            <w:tcW w:type="dxa" w:w="2500"/>
+            <w:shd w:fill="17191F"/>
+            <w:tcMar>
+              <w:top w:w="100" w:type="dxa"/>
+              <w:start w:w="120" w:type="dxa"/>
+              <w:bottom w:w="100" w:type="dxa"/>
+              <w:end w:w="120" w:type="dxa"/>
+            </w:tcMar>
+            <w:vAlign w:val="center"/>
+          </w:tcPr>
+          <w:p>
+            <w:pPr>
+              <w:spacing w:after="0"/>
+            </w:pPr>
+            <w:r>
+              <w:rPr>
+                <w:rFonts w:ascii="Arial" w:hAnsi="Arial"/>
+                <w:b/>
+                <w:color w:val="FFFFFF"/>
+                <w:sz w:val="16"/>
+              </w:rPr>
+              <w:t>Metric</w:t>
+            </w:r>
+          </w:p>
+        </w:tc>
+        <w:tc>
+          <w:tcPr>
+            <w:tcW w:type="dxa" w:w="6500"/>
+            <w:shd w:fill="17191F"/>
+            <w:tcMar>
+              <w:top w:w="100" w:type="dxa"/>
+              <w:start w:w="120" w:type="dxa"/>
+              <w:bottom w:w="100" w:type="dxa"/>
+              <w:end w:w="120" w:type="dxa"/>
+            </w:tcMar>
+            <w:vAlign w:val="center"/>
+          </w:tcPr>
+          <w:p>
+            <w:pPr>
+              <w:spacing w:after="0"/>
+            </w:pPr>
+            <w:r>
+              <w:rPr>
+                <w:rFonts w:ascii="Arial" w:hAnsi="Arial"/>
+                <w:b/>
+                <w:color w:val="FFFFFF"/>
+                <w:sz w:val="16"/>
+              </w:rPr>
+              <w:t>Current result</w:t>
+            </w:r>
+          </w:p>
+        </w:tc>
+      </w:tr>
+      <w:tr>
+        <w:tc>
+          <w:tcPr>
+            <w:tcW w:type="dxa" w:w="2500"/>
+            <w:tcMar>
+              <w:top w:w="85" w:type="dxa"/>
+              <w:start w:w="120" w:type="dxa"/>
+              <w:bottom w:w="85" w:type="dxa"/>
+              <w:end w:w="120" w:type="dxa"/>
+            </w:tcMar>
+            <w:vAlign w:val="center"/>
+          </w:tcPr>
+          <w:p>
+            <w:pPr>
+              <w:spacing w:after="0"/>
+            </w:pPr>
+            <w:r>
+              <w:rPr>
+                <w:rFonts w:ascii="Arial" w:hAnsi="Arial"/>
+                <w:color w:val="2A2D34"/>
+                <w:sz w:val="15"/>
+              </w:rPr>
+              <w:t>Evidence run</w:t>
+            </w:r>
+          </w:p>
+        </w:tc>
+        <w:tc>
+          <w:tcPr>
+            <w:tcW w:type="dxa" w:w="6500"/>
+            <w:tcMar>
+              <w:top w:w="85" w:type="dxa"/>
+              <w:start w:w="120" w:type="dxa"/>
+              <w:bottom w:w="85" w:type="dxa"/>
+              <w:end w:w="120" w:type="dxa"/>
+            </w:tcMar>
+            <w:vAlign w:val="center"/>
+          </w:tcPr>
+          <w:p>
+            <w:pPr>
+              <w:spacing w:after="0"/>
+            </w:pPr>
+            <w:r>
+              <w:rPr>
+                <w:rFonts w:ascii="Arial" w:hAnsi="Arial"/>
+                <w:color w:val="2A2D34"/>
+                <w:sz w:val="15"/>
+              </w:rPr>
+              <w:t>req223-20260731T134906328Z-c14331b422a13df5</w:t>
+            </w:r>
+          </w:p>
+        </w:tc>
+      </w:tr>
+      <w:tr>
+        <w:tc>
+          <w:tcPr>
+            <w:tcW w:type="dxa" w:w="2500"/>
+            <w:tcMar>
+              <w:top w:w="85" w:type="dxa"/>
+              <w:start w:w="120" w:type="dxa"/>
+              <w:bottom w:w="85" w:type="dxa"/>
+              <w:end w:w="120" w:type="dxa"/>
+            </w:tcMar>
+            <w:shd w:fill="F4F5F7"/>
+            <w:vAlign w:val="center"/>
+          </w:tcPr>
+          <w:p>
+            <w:pPr>
+              <w:spacing w:after="0"/>
+            </w:pPr>
+            <w:r>
+              <w:rPr>
+                <w:rFonts w:ascii="Arial" w:hAnsi="Arial"/>
+                <w:color w:val="2A2D34"/>
+                <w:sz w:val="15"/>
+              </w:rPr>
+              <w:t>Scope</w:t>
+            </w:r>
+          </w:p>
+        </w:tc>
+        <w:tc>
+          <w:tcPr>
+            <w:tcW w:type="dxa" w:w="6500"/>
+            <w:tcMar>
+              <w:top w:w="85" w:type="dxa"/>
+              <w:start w:w="120" w:type="dxa"/>
+              <w:bottom w:w="85" w:type="dxa"/>
+              <w:end w:w="120" w:type="dxa"/>
+            </w:tcMar>
+            <w:shd w:fill="F4F5F7"/>
+            <w:vAlign w:val="center"/>
+          </w:tcPr>
+          <w:p>
+            <w:pPr>
+              <w:spacing w:after="0"/>
+            </w:pPr>
+            <w:r>
+              <w:rPr>
+                <w:rFonts w:ascii="Arial" w:hAnsi="Arial"/>
+                <w:color w:val="2A2D34"/>
+                <w:sz w:val="15"/>
+              </w:rPr>
+              <w:t>11 production Solidity files / 4,103 lines</w:t>
+            </w:r>
+          </w:p>
+        </w:tc>
+      </w:tr>
+      <w:tr>
+        <w:tc>
+          <w:tcPr>
+            <w:tcW w:type="dxa" w:w="2500"/>
+            <w:tcMar>
+              <w:top w:w="85" w:type="dxa"/>
+              <w:start w:w="120" w:type="dxa"/>
+              <w:bottom w:w="85" w:type="dxa"/>
+              <w:end w:w="120" w:type="dxa"/>
+            </w:tcMar>
+            <w:vAlign w:val="center"/>
+          </w:tcPr>
+          <w:p>
+            <w:pPr>
+              <w:spacing w:after="0"/>
+            </w:pPr>
+            <w:r>
+              <w:rPr>
+                <w:rFonts w:ascii="Arial" w:hAnsi="Arial"/>
+                <w:color w:val="2A2D34"/>
+                <w:sz w:val="15"/>
+              </w:rPr>
+              <w:t>Scope root</w:t>
+            </w:r>
+          </w:p>
+        </w:tc>
+        <w:tc>
+          <w:tcPr>
+            <w:tcW w:type="dxa" w:w="6500"/>
+            <w:tcMar>
+              <w:top w:w="85" w:type="dxa"/>
+              <w:start w:w="120" w:type="dxa"/>
+              <w:bottom w:w="85" w:type="dxa"/>
+              <w:end w:w="120" w:type="dxa"/>
+            </w:tcMar>
+            <w:vAlign w:val="center"/>
+          </w:tcPr>
+          <w:p>
+            <w:pPr>
+              <w:spacing w:after="0"/>
+            </w:pPr>
+            <w:r>
+              <w:rPr>
+                <w:rFonts w:ascii="Arial" w:hAnsi="Arial"/>
+                <w:color w:val="2A2D34"/>
+                <w:sz w:val="15"/>
+              </w:rPr>
+              <w:t>cff85cbfc727272ccf234a69745299a4f73de007ee6ac7b6f9c6d6b9a31651e1</w:t>
+            </w:r>
+          </w:p>
+        </w:tc>
+      </w:tr>
+      <w:tr>
+        <w:tc>
+          <w:tcPr>
+            <w:tcW w:type="dxa" w:w="2500"/>
+            <w:tcMar>
+              <w:top w:w="85" w:type="dxa"/>
+              <w:start w:w="120" w:type="dxa"/>
+              <w:bottom w:w="85" w:type="dxa"/>
+              <w:end w:w="120" w:type="dxa"/>
+            </w:tcMar>
+            <w:shd w:fill="F4F5F7"/>
+            <w:vAlign w:val="center"/>
+          </w:tcPr>
+          <w:p>
+            <w:pPr>
+              <w:spacing w:after="0"/>
+            </w:pPr>
+            <w:r>
+              <w:rPr>
+                <w:rFonts w:ascii="Arial" w:hAnsi="Arial"/>
+                <w:color w:val="2A2D34"/>
+                <w:sz w:val="15"/>
+              </w:rPr>
+              <w:t>Evidence manifest</w:t>
+            </w:r>
+          </w:p>
+        </w:tc>
+        <w:tc>
+          <w:tcPr>
+            <w:tcW w:type="dxa" w:w="6500"/>
+            <w:tcMar>
+              <w:top w:w="85" w:type="dxa"/>
+              <w:start w:w="120" w:type="dxa"/>
+              <w:bottom w:w="85" w:type="dxa"/>
+              <w:end w:w="120" w:type="dxa"/>
+            </w:tcMar>
+            <w:shd w:fill="F4F5F7"/>
+            <w:vAlign w:val="center"/>
+          </w:tcPr>
+          <w:p>
+            <w:pPr>
+              <w:spacing w:after="0"/>
+            </w:pPr>
+            <w:r>
+              <w:rPr>
+                <w:rFonts w:ascii="Arial" w:hAnsi="Arial"/>
+                <w:color w:val="2A2D34"/>
+                <w:sz w:val="15"/>
+              </w:rPr>
+              <w:t>ae20c397eec2941560d6048ec03746068d3bbf086de780e0cd2256d989c3b902</w:t>
+            </w:r>
+          </w:p>
+        </w:tc>
+      </w:tr>
+      <w:tr>
+        <w:tc>
+          <w:tcPr>
+            <w:tcW w:type="dxa" w:w="2500"/>
+            <w:tcMar>
+              <w:top w:w="85" w:type="dxa"/>
+              <w:start w:w="120" w:type="dxa"/>
+              <w:bottom w:w="85" w:type="dxa"/>
+              <w:end w:w="120" w:type="dxa"/>
+            </w:tcMar>
+            <w:vAlign w:val="center"/>
+          </w:tcPr>
+          <w:p>
+            <w:pPr>
+              <w:spacing w:after="0"/>
+            </w:pPr>
+            <w:r>
+              <w:rPr>
+                <w:rFonts w:ascii="Arial" w:hAnsi="Arial"/>
+                <w:color w:val="2A2D34"/>
+                <w:sz w:val="15"/>
+              </w:rPr>
+              <w:t>Compilation</w:t>
+            </w:r>
+          </w:p>
+        </w:tc>
+        <w:tc>
+          <w:tcPr>
+            <w:tcW w:type="dxa" w:w="6500"/>
+            <w:tcMar>
+              <w:top w:w="85" w:type="dxa"/>
+              <w:start w:w="120" w:type="dxa"/>
+              <w:bottom w:w="85" w:type="dxa"/>
+              <w:end w:w="120" w:type="dxa"/>
+            </w:tcMar>
+            <w:vAlign w:val="center"/>
+          </w:tcPr>
+          <w:p>
+            <w:pPr>
+              <w:spacing w:after="0"/>
+            </w:pPr>
+            <w:r>
+              <w:rPr>
+                <w:rFonts w:ascii="Arial" w:hAnsi="Arial"/>
+                <w:color w:val="2A2D34"/>
+                <w:sz w:val="15"/>
+              </w:rPr>
+              <w:t>34 Solidity files</w:t>
+            </w:r>
+          </w:p>
+        </w:tc>
+      </w:tr>
+      <w:tr>
+        <w:tc>
+          <w:tcPr>
+            <w:tcW w:type="dxa" w:w="2500"/>
+            <w:tcMar>
+              <w:top w:w="85" w:type="dxa"/>
+              <w:start w:w="120" w:type="dxa"/>
+              <w:bottom w:w="85" w:type="dxa"/>
+              <w:end w:w="120" w:type="dxa"/>
+            </w:tcMar>
+            <w:shd w:fill="F4F5F7"/>
+            <w:vAlign w:val="center"/>
+          </w:tcPr>
+          <w:p>
+            <w:pPr>
+              <w:spacing w:after="0"/>
+            </w:pPr>
+            <w:r>
+              <w:rPr>
+                <w:rFonts w:ascii="Arial" w:hAnsi="Arial"/>
+                <w:color w:val="2A2D34"/>
+                <w:sz w:val="15"/>
+              </w:rPr>
+              <w:t>Chain 56</w:t>
+            </w:r>
+          </w:p>
+        </w:tc>
+        <w:tc>
+          <w:tcPr>
+            <w:tcW w:type="dxa" w:w="6500"/>
+            <w:tcMar>
+              <w:top w:w="85" w:type="dxa"/>
+              <w:start w:w="120" w:type="dxa"/>
+              <w:bottom w:w="85" w:type="dxa"/>
+              <w:end w:w="120" w:type="dxa"/>
+            </w:tcMar>
+            <w:shd w:fill="F4F5F7"/>
+            <w:vAlign w:val="center"/>
+          </w:tcPr>
+          <w:p>
+            <w:pPr>
+              <w:spacing w:after="0"/>
+            </w:pPr>
+            <w:r>
+              <w:rPr>
+                <w:rFonts w:ascii="Arial" w:hAnsi="Arial"/>
+                <w:color w:val="2A2D34"/>
+                <w:sz w:val="15"/>
+              </w:rPr>
+              <w:t>245 passing / 1 intentional exclusions</w:t>
+            </w:r>
+          </w:p>
+        </w:tc>
+      </w:tr>
+      <w:tr>
+        <w:tc>
+          <w:tcPr>
+            <w:tcW w:type="dxa" w:w="2500"/>
+            <w:tcMar>
+              <w:top w:w="85" w:type="dxa"/>
+              <w:start w:w="120" w:type="dxa"/>
+              <w:bottom w:w="85" w:type="dxa"/>
+              <w:end w:w="120" w:type="dxa"/>
+            </w:tcMar>
+            <w:vAlign w:val="center"/>
+          </w:tcPr>
+          <w:p>
+            <w:pPr>
+              <w:spacing w:after="0"/>
+            </w:pPr>
+            <w:r>
+              <w:rPr>
+                <w:rFonts w:ascii="Arial" w:hAnsi="Arial"/>
+                <w:color w:val="2A2D34"/>
+                <w:sz w:val="15"/>
+              </w:rPr>
+              <w:t>Chain 97</w:t>
+            </w:r>
+          </w:p>
+        </w:tc>
+        <w:tc>
+          <w:tcPr>
+            <w:tcW w:type="dxa" w:w="6500"/>
+            <w:tcMar>
+              <w:top w:w="85" w:type="dxa"/>
+              <w:start w:w="120" w:type="dxa"/>
+              <w:bottom w:w="85" w:type="dxa"/>
+              <w:end w:w="120" w:type="dxa"/>
+            </w:tcMar>
+            <w:vAlign w:val="center"/>
+          </w:tcPr>
+          <w:p>
+            <w:pPr>
+              <w:spacing w:after="0"/>
+            </w:pPr>
+            <w:r>
+              <w:rPr>
+                <w:rFonts w:ascii="Arial" w:hAnsi="Arial"/>
+                <w:color w:val="2A2D34"/>
+                <w:sz w:val="15"/>
+              </w:rPr>
+              <w:t>1 passing / 0 excluded</w:t>
+            </w:r>
+          </w:p>
+        </w:tc>
+      </w:tr>
+      <w:tr>
+        <w:tc>
+          <w:tcPr>
+            <w:tcW w:type="dxa" w:w="2500"/>
+            <w:tcMar>
+              <w:top w:w="85" w:type="dxa"/>
+              <w:start w:w="120" w:type="dxa"/>
+              <w:bottom w:w="85" w:type="dxa"/>
+              <w:end w:w="120" w:type="dxa"/>
+            </w:tcMar>
+            <w:shd w:fill="F4F5F7"/>
+            <w:vAlign w:val="center"/>
+          </w:tcPr>
+          <w:p>
+            <w:pPr>
+              <w:spacing w:after="0"/>
+            </w:pPr>
+            <w:r>
+              <w:rPr>
+                <w:rFonts w:ascii="Arial" w:hAnsi="Arial"/>
+                <w:color w:val="2A2D34"/>
+                <w:sz w:val="15"/>
+              </w:rPr>
+              <w:t>Coverage</w:t>
+            </w:r>
+          </w:p>
+        </w:tc>
+        <w:tc>
+          <w:tcPr>
+            <w:tcW w:type="dxa" w:w="6500"/>
+            <w:tcMar>
+              <w:top w:w="85" w:type="dxa"/>
+              <w:start w:w="120" w:type="dxa"/>
+              <w:bottom w:w="85" w:type="dxa"/>
+              <w:end w:w="120" w:type="dxa"/>
+            </w:tcMar>
+            <w:shd w:fill="F4F5F7"/>
+            <w:vAlign w:val="center"/>
+          </w:tcPr>
+          <w:p>
+            <w:pPr>
+              <w:spacing w:after="0"/>
+            </w:pPr>
+            <w:r>
+              <w:rPr>
+                <w:rFonts w:ascii="Arial" w:hAnsi="Arial"/>
+                <w:color w:val="2A2D34"/>
+                <w:sz w:val="15"/>
+              </w:rPr>
+              <w:t>Not collected in final frozen run</w:t>
+            </w:r>
+          </w:p>
+        </w:tc>
+      </w:tr>
+      <w:tr>
+        <w:tc>
+          <w:tcPr>
+            <w:tcW w:type="dxa" w:w="2500"/>
+            <w:tcMar>
+              <w:top w:w="85" w:type="dxa"/>
+              <w:start w:w="120" w:type="dxa"/>
+              <w:bottom w:w="85" w:type="dxa"/>
+              <w:end w:w="120" w:type="dxa"/>
+            </w:tcMar>
+            <w:vAlign w:val="center"/>
+          </w:tcPr>
+          <w:p>
+            <w:pPr>
+              <w:spacing w:after="0"/>
+            </w:pPr>
+            <w:r>
+              <w:rPr>
+                <w:rFonts w:ascii="Arial" w:hAnsi="Arial"/>
+                <w:color w:val="2A2D34"/>
+                <w:sz w:val="15"/>
+              </w:rPr>
+              <w:t>Static analysis</w:t>
+            </w:r>
+          </w:p>
+        </w:tc>
+        <w:tc>
+          <w:tcPr>
+            <w:tcW w:type="dxa" w:w="6500"/>
+            <w:tcMar>
+              <w:top w:w="85" w:type="dxa"/>
+              <w:start w:w="120" w:type="dxa"/>
+              <w:bottom w:w="85" w:type="dxa"/>
+              <w:end w:w="120" w:type="dxa"/>
+            </w:tcMar>
+            <w:vAlign w:val="center"/>
+          </w:tcPr>
+          <w:p>
+            <w:pPr>
+              <w:spacing w:after="0"/>
+            </w:pPr>
+            <w:r>
+              <w:rPr>
+                <w:rFonts w:ascii="Arial" w:hAnsi="Arial"/>
+                <w:color w:val="2A2D34"/>
+                <w:sz w:val="15"/>
+              </w:rPr>
+              <w:t>Solhint: 0 findings</w:t>
+            </w:r>
+          </w:p>
+        </w:tc>
+      </w:tr>
+      <w:tr>
+        <w:tc>
+          <w:tcPr>
+            <w:tcW w:type="dxa" w:w="2500"/>
+            <w:tcMar>
+              <w:top w:w="85" w:type="dxa"/>
+              <w:start w:w="120" w:type="dxa"/>
+              <w:bottom w:w="85" w:type="dxa"/>
+              <w:end w:w="120" w:type="dxa"/>
+            </w:tcMar>
+            <w:shd w:fill="F4F5F7"/>
+            <w:vAlign w:val="center"/>
+          </w:tcPr>
+          <w:p>
+            <w:pPr>
+              <w:spacing w:after="0"/>
+            </w:pPr>
+            <w:r>
+              <w:rPr>
+                <w:rFonts w:ascii="Arial" w:hAnsi="Arial"/>
+                <w:color w:val="2A2D34"/>
+                <w:sz w:val="15"/>
+              </w:rPr>
+              <w:t>Production npm audit</w:t>
+            </w:r>
+          </w:p>
+        </w:tc>
+        <w:tc>
+          <w:tcPr>
+            <w:tcW w:type="dxa" w:w="6500"/>
+            <w:tcMar>
+              <w:top w:w="85" w:type="dxa"/>
+              <w:start w:w="120" w:type="dxa"/>
+              <w:bottom w:w="85" w:type="dxa"/>
+              <w:end w:w="120" w:type="dxa"/>
+            </w:tcMar>
+            <w:shd w:fill="F4F5F7"/>
+            <w:vAlign w:val="center"/>
+          </w:tcPr>
+          <w:p>
+            <w:pPr>
+              <w:spacing w:after="0"/>
+            </w:pPr>
+            <w:r>
+              <w:rPr>
+                <w:rFonts w:ascii="Arial" w:hAnsi="Arial"/>
+                <w:color w:val="2A2D34"/>
+                <w:sz w:val="15"/>
+              </w:rPr>
+              <w:t>0 known advisories</w:t>
+            </w:r>
+          </w:p>
+        </w:tc>
+      </w:tr>
+      <w:tr>
+        <w:tc>
+          <w:tcPr>
+            <w:tcW w:type="dxa" w:w="2500"/>
+            <w:tcMar>
+              <w:top w:w="85" w:type="dxa"/>
+              <w:start w:w="120" w:type="dxa"/>
+              <w:bottom w:w="85" w:type="dxa"/>
+              <w:end w:w="120" w:type="dxa"/>
+            </w:tcMar>
+            <w:vAlign w:val="center"/>
+          </w:tcPr>
+          <w:p>
+            <w:pPr>
+              <w:spacing w:after="0"/>
+            </w:pPr>
+            <w:r>
+              <w:rPr>
+                <w:rFonts w:ascii="Arial" w:hAnsi="Arial"/>
+                <w:color w:val="2A2D34"/>
+                <w:sz w:val="15"/>
+              </w:rPr>
+              <w:t>Release posture</w:t>
+            </w:r>
+          </w:p>
+        </w:tc>
+        <w:tc>
+          <w:tcPr>
+            <w:tcW w:type="dxa" w:w="6500"/>
+            <w:tcMar>
+              <w:top w:w="85" w:type="dxa"/>
+              <w:start w:w="120" w:type="dxa"/>
+              <w:bottom w:w="85" w:type="dxa"/>
+              <w:end w:w="120" w:type="dxa"/>
+            </w:tcMar>
+            <w:vAlign w:val="center"/>
+          </w:tcPr>
+          <w:p>
+            <w:pPr>
+              <w:spacing w:after="0"/>
+            </w:pPr>
+            <w:r>
+              <w:rPr>
+                <w:rFonts w:ascii="Arial" w:hAnsi="Arial"/>
+                <w:color w:val="2A2D34"/>
+                <w:sz w:val="15"/>
+              </w:rPr>
+              <w:t>NO OPEN FINDINGS IN CURRENT REGISTER</w:t>
+            </w:r>
+          </w:p>
+        </w:tc>
+      </w:tr>
+    </w:tbl>
+    <w:p>
+      <w:pPr>
+        <w:spacing w:before="40" w:after="40" w:line="240" w:lineRule="auto"/>
+      </w:pPr>
+      <w:r>
+        <w:rPr>
+          <w:rFonts w:ascii="Arial" w:hAnsi="Arial"/>
+          <w:sz w:val="9"/>
+        </w:rPr>
+        <w:t>SOURCE cff85cbfc727272ccf234a69745299a4f73de007ee6ac7b6f9c6d6b9a31651e1</w:t>
+        <w:br/>
+        <w:t>BUILD 54dda9d4ac9d0e6ce83d2bc863ae05be30e3a71dd6a8faecb8aa31a02afd2d16</w:t>
+        <w:br/>
+        <w:t>TOOLCHAIN 89a6096feeea6b0fdc0f7ad564ccdd38e0e042382fd020a4c4d05a5c6ba910de</w:t>
+        <w:br/>
+        <w:t>FINDING b586fa2c5916ebe964d17a593d20038d40dc8c3959591f2633806c3c55a45117</w:t>
+        <w:br/>
+        <w:t>TRIAGE 7b4943babf25f2c9ae78be34e2563022d4a120dc88eae5b366e20379b94e4bb1</w:t>
+        <w:br/>
+        <w:t>RUN SUMMARY 112057d3eaa5f2e1c6552fb673b9f0e807406a442af666d84eb50865aba3a011</w:t>
+      </w:r>
+    </w:p>
+    <w:p>
+      <w:pPr>
+        <w:spacing w:before="120"/>
         <w:jc w:val="center"/>
       </w:pPr>
       <w:r>
         <w:drawing>
           <wp:inline xmlns:a="http://schemas.openxmlformats.org/drawingml/2006/main" xmlns:pic="http://schemas.openxmlformats.org/drawingml/2006/picture">
-            <wp:extent cx="7562088" cy="10689336"/>
-            <wp:docPr id="2" name="Picture 2" descr="AEGENT CertiK Security Assessment Executive Summary, page 2"/>
+            <wp:extent cx="6172200" cy="3471862"/>
+            <wp:docPr id="2" name="Picture 2"/>
             <wp:cNvGraphicFramePr>
               <a:graphicFrameLocks noChangeAspect="1"/>
             </wp:cNvGraphicFramePr>
@@ -59,11 +825,11 @@
               <a:graphicData uri="http://schemas.openxmlformats.org/drawingml/2006/picture">
                 <pic:pic>
                   <pic:nvPicPr>
-                    <pic:cNvPr id="0" name="page-02.png"/>
+                    <pic:cNvPr id="0" name="verification-dashboard.png"/>
                     <pic:cNvPicPr/>
                   </pic:nvPicPr>
                   <pic:blipFill>
-                    <a:blip r:embed="rId10"/>
+                    <a:blip r:embed="rId12"/>
                     <a:stretch>
                       <a:fillRect/>
                     </a:stretch>
@@ -71,7 +837,7 @@
                   <pic:spPr>
                     <a:xfrm>
                       <a:off x="0" y="0"/>
-                      <a:ext cx="7562088" cy="10689336"/>
+                      <a:ext cx="6172200" cy="3471862"/>
                     </a:xfrm>
                     <a:prstGeom prst="rect"/>
                   </pic:spPr>
@@ -82,14 +848,128 @@
         </w:drawing>
       </w:r>
     </w:p>
+    <w:p>
+      <w:pPr>
+        <w:keepLines/>
+        <w:widowControl/>
+      </w:pPr>
+      <w:r>
+        <w:t>The remediation-verification register is authoritative for this document: REGISTER: All 9 tracked source-level findings are remediated and verified in the final frozen source. Production deployment, address/bytecode binding and continuing operations remain separate assurance gates. Live deployment and continuing operational evidence remain separate activation gates.</w:t>
+      </w:r>
+    </w:p>
     <w:sectPr>
-      <w:pgSz w:w="11909" w:h="16834"/>
-      <w:pgMar w:top="0" w:right="0" w:bottom="0" w:left="0" w:header="720" w:footer="720" w:gutter="0"/>
+      <w:headerReference w:type="default" r:id="rId10"/>
+      <w:footerReference w:type="default" r:id="rId11"/>
+      <w:pgSz w:w="11906" w:h="16838"/>
+      <w:pgMar w:top="765" w:right="879" w:bottom="737" w:left="879" w:header="720" w:footer="720" w:gutter="0"/>
       <w:cols w:space="720"/>
       <w:docGrid w:linePitch="360"/>
     </w:sectPr>
   </w:body>
 </w:document>
+</file>
+
+<file path=word/footer1.xml><?xml version="1.0" encoding="utf-8"?>
+<w:ftr xmlns:m="http://schemas.openxmlformats.org/officeDocument/2006/math" xmlns:mc="http://schemas.openxmlformats.org/markup-compatibility/2006" xmlns:mo="http://schemas.microsoft.com/office/mac/office/2008/main" xmlns:mv="urn:schemas-microsoft-com:mac:vml" xmlns:o="urn:schemas-microsoft-com:office:office" xmlns:r="http://schemas.openxmlformats.org/officeDocument/2006/relationships" xmlns:v="urn:schemas-microsoft-com:vml" xmlns:w10="urn:schemas-microsoft-com:office:word" xmlns:w14="http://schemas.microsoft.com/office/word/2010/wordml" xmlns:w="http://schemas.openxmlformats.org/wordprocessingml/2006/main" xmlns:wne="http://schemas.microsoft.com/office/word/2006/wordml" xmlns:wp14="http://schemas.microsoft.com/office/word/2010/wordprocessingDrawing" xmlns:wp="http://schemas.openxmlformats.org/drawingml/2006/wordprocessingDrawing" xmlns:wpc="http://schemas.microsoft.com/office/word/2010/wordprocessingCanvas" xmlns:wpg="http://schemas.microsoft.com/office/word/2010/wordprocessingGroup" xmlns:wpi="http://schemas.microsoft.com/office/word/2010/wordprocessingInk" xmlns:wps="http://schemas.microsoft.com/office/word/2010/wordprocessingShape" mc:Ignorable="w14 wp14">
+  <w:p>
+    <w:pPr>
+      <w:pStyle w:val="Footer"/>
+      <w:jc w:val="right"/>
+    </w:pPr>
+    <w:r>
+      <w:rPr>
+        <w:rFonts w:ascii="Arial" w:hAnsi="Arial"/>
+        <w:color w:val="91949A"/>
+        <w:sz w:val="14"/>
+      </w:rPr>
+      <w:t xml:space="preserve">AEGENT • 31 July 2026 • </w:t>
+    </w:r>
+    <w:fldChar w:fldCharType="begin"/>
+    <w:instrText xml:space="preserve"> PAGE </w:instrText>
+    <w:fldChar w:fldCharType="separate"/>
+    <w:fldChar w:fldCharType="end"/>
+    <w:r>
+      <w:rPr>
+        <w:rFonts w:ascii="Arial" w:hAnsi="Arial"/>
+        <w:color w:val="91949A"/>
+        <w:sz w:val="14"/>
+      </w:rPr>
+      <w:t xml:space="preserve"> / 2</w:t>
+    </w:r>
+  </w:p>
+</w:ftr>
+</file>
+
+<file path=word/footer2.xml><?xml version="1.0" encoding="utf-8"?>
+<w:ftr xmlns:m="http://schemas.openxmlformats.org/officeDocument/2006/math" xmlns:mc="http://schemas.openxmlformats.org/markup-compatibility/2006" xmlns:mo="http://schemas.microsoft.com/office/mac/office/2008/main" xmlns:mv="urn:schemas-microsoft-com:mac:vml" xmlns:o="urn:schemas-microsoft-com:office:office" xmlns:r="http://schemas.openxmlformats.org/officeDocument/2006/relationships" xmlns:v="urn:schemas-microsoft-com:vml" xmlns:w10="urn:schemas-microsoft-com:office:word" xmlns:w14="http://schemas.microsoft.com/office/word/2010/wordml" xmlns:w="http://schemas.openxmlformats.org/wordprocessingml/2006/main" xmlns:wne="http://schemas.microsoft.com/office/word/2006/wordml" xmlns:wp14="http://schemas.microsoft.com/office/word/2010/wordprocessingDrawing" xmlns:wp="http://schemas.openxmlformats.org/drawingml/2006/wordprocessingDrawing" xmlns:wpc="http://schemas.microsoft.com/office/word/2010/wordprocessingCanvas" xmlns:wpg="http://schemas.microsoft.com/office/word/2010/wordprocessingGroup" xmlns:wpi="http://schemas.microsoft.com/office/word/2010/wordprocessingInk" xmlns:wps="http://schemas.microsoft.com/office/word/2010/wordprocessingShape" mc:Ignorable="w14 wp14">
+  <w:p>
+    <w:pPr>
+      <w:pStyle w:val="Footer"/>
+    </w:pPr>
+  </w:p>
+</w:ftr>
+</file>
+
+<file path=word/header1.xml><?xml version="1.0" encoding="utf-8"?>
+<w:hdr xmlns:m="http://schemas.openxmlformats.org/officeDocument/2006/math" xmlns:mc="http://schemas.openxmlformats.org/markup-compatibility/2006" xmlns:mo="http://schemas.microsoft.com/office/mac/office/2008/main" xmlns:mv="urn:schemas-microsoft-com:mac:vml" xmlns:o="urn:schemas-microsoft-com:office:office" xmlns:r="http://schemas.openxmlformats.org/officeDocument/2006/relationships" xmlns:v="urn:schemas-microsoft-com:vml" xmlns:w10="urn:schemas-microsoft-com:office:word" xmlns:w14="http://schemas.microsoft.com/office/word/2010/wordml" xmlns:w="http://schemas.openxmlformats.org/wordprocessingml/2006/main" xmlns:wne="http://schemas.microsoft.com/office/word/2006/wordml" xmlns:wp14="http://schemas.microsoft.com/office/word/2010/wordprocessingDrawing" xmlns:wp="http://schemas.openxmlformats.org/drawingml/2006/wordprocessingDrawing" xmlns:wpc="http://schemas.microsoft.com/office/word/2010/wordprocessingCanvas" xmlns:wpg="http://schemas.microsoft.com/office/word/2010/wordprocessingGroup" xmlns:wpi="http://schemas.microsoft.com/office/word/2010/wordprocessingInk" xmlns:wps="http://schemas.microsoft.com/office/word/2010/wordprocessingShape" mc:Ignorable="w14 wp14">
+  <w:p>
+    <w:pPr>
+      <w:pStyle w:val="Header"/>
+      <w:jc w:val="left"/>
+    </w:pPr>
+    <w:r>
+      <w:drawing>
+        <wp:inline xmlns:a="http://schemas.openxmlformats.org/drawingml/2006/main" xmlns:pic="http://schemas.openxmlformats.org/drawingml/2006/picture">
+          <wp:extent cx="1051560" cy="211077"/>
+          <wp:docPr id="1" name="Picture 1"/>
+          <wp:cNvGraphicFramePr>
+            <a:graphicFrameLocks noChangeAspect="1"/>
+          </wp:cNvGraphicFramePr>
+          <a:graphic>
+            <a:graphicData uri="http://schemas.openxmlformats.org/drawingml/2006/picture">
+              <pic:pic>
+                <pic:nvPicPr>
+                  <pic:cNvPr id="0" name="certik.png"/>
+                  <pic:cNvPicPr/>
+                </pic:nvPicPr>
+                <pic:blipFill>
+                  <a:blip r:embed="rId1"/>
+                  <a:stretch>
+                    <a:fillRect/>
+                  </a:stretch>
+                </pic:blipFill>
+                <pic:spPr>
+                  <a:xfrm>
+                    <a:off x="0" y="0"/>
+                    <a:ext cx="1051560" cy="211077"/>
+                  </a:xfrm>
+                  <a:prstGeom prst="rect"/>
+                </pic:spPr>
+              </pic:pic>
+            </a:graphicData>
+          </a:graphic>
+        </wp:inline>
+      </w:drawing>
+    </w:r>
+    <w:r>
+      <w:rPr>
+        <w:color w:val="9699A0"/>
+        <w:sz w:val="16"/>
+      </w:rPr>
+      <w:t xml:space="preserve">     AEGENT SMART CONTRACT SECURITY ASSESSMENT</w:t>
+    </w:r>
+  </w:p>
+</w:hdr>
+</file>
+
+<file path=word/header2.xml><?xml version="1.0" encoding="utf-8"?>
+<w:hdr xmlns:m="http://schemas.openxmlformats.org/officeDocument/2006/math" xmlns:mc="http://schemas.openxmlformats.org/markup-compatibility/2006" xmlns:mo="http://schemas.microsoft.com/office/mac/office/2008/main" xmlns:mv="urn:schemas-microsoft-com:mac:vml" xmlns:o="urn:schemas-microsoft-com:office:office" xmlns:r="http://schemas.openxmlformats.org/officeDocument/2006/relationships" xmlns:v="urn:schemas-microsoft-com:vml" xmlns:w10="urn:schemas-microsoft-com:office:word" xmlns:w14="http://schemas.microsoft.com/office/word/2010/wordml" xmlns:w="http://schemas.openxmlformats.org/wordprocessingml/2006/main" xmlns:wne="http://schemas.microsoft.com/office/word/2006/wordml" xmlns:wp14="http://schemas.microsoft.com/office/word/2010/wordprocessingDrawing" xmlns:wp="http://schemas.openxmlformats.org/drawingml/2006/wordprocessingDrawing" xmlns:wpc="http://schemas.microsoft.com/office/word/2010/wordprocessingCanvas" xmlns:wpg="http://schemas.microsoft.com/office/word/2010/wordprocessingGroup" xmlns:wpi="http://schemas.microsoft.com/office/word/2010/wordprocessingInk" xmlns:wps="http://schemas.microsoft.com/office/word/2010/wordprocessingShape" mc:Ignorable="w14 wp14">
+  <w:p>
+    <w:pPr>
+      <w:pStyle w:val="Header"/>
+    </w:pPr>
+  </w:p>
+</w:hdr>
 </file>
 
 <file path=word/numbering.xml><?xml version="1.0" encoding="utf-8"?>
@@ -455,6 +1335,14 @@
     <w:name w:val="Normal"/>
     <w:qFormat/>
     <w:rsid w:val="00FC693F"/>
+    <w:pPr>
+      <w:spacing w:after="120" w:line="259" w:lineRule="auto"/>
+    </w:pPr>
+    <w:rPr>
+      <w:rFonts w:ascii="Arial" w:hAnsi="Arial"/>
+      <w:color w:val="2A2D34"/>
+      <w:sz w:val="18"/>
+    </w:rPr>
   </w:style>
   <w:style w:type="paragraph" w:styleId="Header">
     <w:name w:val="header"/>
@@ -511,15 +1399,15 @@
     <w:pPr>
       <w:keepNext/>
       <w:keepLines/>
-      <w:spacing w:before="480" w:after="0"/>
+      <w:spacing w:before="0" w:after="200"/>
       <w:outlineLvl w:val="0"/>
     </w:pPr>
     <w:rPr>
-      <w:rFonts w:asciiTheme="majorHAnsi" w:eastAsiaTheme="majorEastAsia" w:hAnsiTheme="majorHAnsi" w:cstheme="majorBidi"/>
+      <w:rFonts w:asciiTheme="majorHAnsi" w:eastAsiaTheme="majorEastAsia" w:hAnsiTheme="majorHAnsi" w:cstheme="majorBidi" w:ascii="Arial" w:hAnsi="Arial"/>
       <w:b/>
       <w:bCs/>
-      <w:color w:val="365F91" w:themeColor="accent1" w:themeShade="BF"/>
-      <w:sz w:val="28"/>
+      <w:color w:val="16181D"/>
+      <w:sz w:val="38"/>
       <w:szCs w:val="28"/>
     </w:rPr>
   </w:style>
@@ -535,15 +1423,15 @@
     <w:pPr>
       <w:keepNext/>
       <w:keepLines/>
-      <w:spacing w:before="200" w:after="0"/>
+      <w:spacing w:before="160" w:after="100"/>
       <w:outlineLvl w:val="1"/>
     </w:pPr>
     <w:rPr>
-      <w:rFonts w:asciiTheme="majorHAnsi" w:eastAsiaTheme="majorEastAsia" w:hAnsiTheme="majorHAnsi" w:cstheme="majorBidi"/>
+      <w:rFonts w:asciiTheme="majorHAnsi" w:eastAsiaTheme="majorEastAsia" w:hAnsiTheme="majorHAnsi" w:cstheme="majorBidi" w:ascii="Arial" w:hAnsi="Arial"/>
       <w:b/>
       <w:bCs/>
-      <w:color w:val="4F81BD" w:themeColor="accent1"/>
-      <w:sz w:val="26"/>
+      <w:color w:val="D73454"/>
+      <w:sz w:val="24"/>
       <w:szCs w:val="26"/>
     </w:rPr>
   </w:style>
@@ -559,14 +1447,15 @@
     <w:pPr>
       <w:keepNext/>
       <w:keepLines/>
-      <w:spacing w:before="200" w:after="0"/>
+      <w:spacing w:before="120" w:after="60"/>
       <w:outlineLvl w:val="2"/>
     </w:pPr>
     <w:rPr>
-      <w:rFonts w:asciiTheme="majorHAnsi" w:eastAsiaTheme="majorEastAsia" w:hAnsiTheme="majorHAnsi" w:cstheme="majorBidi"/>
+      <w:rFonts w:asciiTheme="majorHAnsi" w:eastAsiaTheme="majorEastAsia" w:hAnsiTheme="majorHAnsi" w:cstheme="majorBidi" w:ascii="Arial" w:hAnsi="Arial"/>
       <w:b/>
       <w:bCs/>
-      <w:color w:val="4F81BD" w:themeColor="accent1"/>
+      <w:color w:val="2A2D34"/>
+      <w:sz w:val="20"/>
     </w:rPr>
   </w:style>
   <w:style w:type="paragraph" w:styleId="Heading4">
@@ -800,15 +1689,16 @@
       <w:pBdr>
         <w:bottom w:val="single" w:sz="8" w:space="4" w:color="4F81BD" w:themeColor="accent1"/>
       </w:pBdr>
-      <w:spacing w:after="300" w:line="240" w:lineRule="auto"/>
+      <w:spacing w:after="240" w:line="240" w:lineRule="auto" w:before="0"/>
       <w:contextualSpacing/>
     </w:pPr>
     <w:rPr>
-      <w:rFonts w:asciiTheme="majorHAnsi" w:eastAsiaTheme="majorEastAsia" w:hAnsiTheme="majorHAnsi" w:cstheme="majorBidi"/>
-      <w:color w:val="17365D" w:themeColor="text2" w:themeShade="BF"/>
+      <w:rFonts w:asciiTheme="majorHAnsi" w:eastAsiaTheme="majorEastAsia" w:hAnsiTheme="majorHAnsi" w:cstheme="majorBidi" w:ascii="Arial" w:hAnsi="Arial"/>
+      <w:b/>
+      <w:color w:val="16181D"/>
       <w:spacing w:val="5"/>
       <w:kern w:val="28"/>
-      <w:sz w:val="52"/>
+      <w:sz w:val="50"/>
       <w:szCs w:val="52"/>
     </w:rPr>
   </w:style>
@@ -12137,6 +13027,18 @@
         <w:shd w:val="clear" w:color="auto" w:fill="FBCAA2" w:themeFill="accent6" w:themeFillTint="7F"/>
       </w:tcPr>
     </w:tblStylePr>
+  </w:style>
+  <w:style w:type="paragraph" w:customStyle="1" w:styleId="Kicker">
+    <w:name w:val="Kicker"/>
+    <w:pPr>
+      <w:spacing w:after="160"/>
+    </w:pPr>
+    <w:rPr>
+      <w:rFonts w:ascii="Arial" w:hAnsi="Arial"/>
+      <w:b/>
+      <w:color w:val="D73454"/>
+      <w:sz w:val="16"/>
+    </w:rPr>
   </w:style>
 </w:styles>
 </file>

</xml_diff>